<commit_message>
Update conversion documentation and converter form
</commit_message>
<xml_diff>
--- a/docs/guides/Westminster_Chimes_and_Carillon_Bells_8_1_Engineering_Guide.docx
+++ b/docs/guides/Westminster_Chimes_and_Carillon_Bells_8_1_Engineering_Guide.docx
@@ -4874,6 +4874,458 @@
     <w:p>
       <w:r>
         <w:t>This document is intended to give a future maintainer or operator enough context to understand how the application is organized, how it runs, and where to begin when changing behavior.</w:t>
+      </w:r>
+    </w:p>
+    <w:p>
+      <w:r>
+        <w:br w:type="page"/>
+      </w:r>
+    </w:p>
+    <w:p>
+      <w:pPr>
+        <w:pStyle w:val="Heading1"/>
+      </w:pPr>
+      <w:r>
+        <w:t>21. 7.2.4 to 8.1 Database Conversion Utility</w:t>
+      </w:r>
+    </w:p>
+    <w:p>
+      <w:r>
+        <w:t>The conversion program is a separate FMX utility project located under Conversion program. It upgrades a Carillon 7.2.4 SQLite database in place so the database is compatible with version 8.1.</w:t>
+      </w:r>
+    </w:p>
+    <w:p>
+      <w:pPr>
+        <w:pStyle w:val="Heading2"/>
+      </w:pPr>
+      <w:r>
+        <w:t>Project files</w:t>
+      </w:r>
+    </w:p>
+    <w:p>
+      <w:pPr>
+        <w:pStyle w:val="ListBullet"/>
+        <w:spacing w:after="80"/>
+        <w:ind w:left="540" w:hanging="271"/>
+      </w:pPr>
+      <w:r>
+        <w:t>Conversion program\CarillonDBUpgrade724To81.dproj</w:t>
+      </w:r>
+    </w:p>
+    <w:p>
+      <w:pPr>
+        <w:pStyle w:val="ListBullet"/>
+        <w:spacing w:after="80"/>
+        <w:ind w:left="540" w:hanging="271"/>
+      </w:pPr>
+      <w:r>
+        <w:t>Conversion program\CarillonDBUpgrade724To81.dpr</w:t>
+      </w:r>
+    </w:p>
+    <w:p>
+      <w:pPr>
+        <w:pStyle w:val="ListBullet"/>
+        <w:spacing w:after="80"/>
+        <w:ind w:left="540" w:hanging="271"/>
+      </w:pPr>
+      <w:r>
+        <w:t>Conversion program\DBUpgrade724To81Main.pas</w:t>
+      </w:r>
+    </w:p>
+    <w:p>
+      <w:pPr>
+        <w:pStyle w:val="ListBullet"/>
+        <w:spacing w:after="80"/>
+        <w:ind w:left="540" w:hanging="271"/>
+      </w:pPr>
+      <w:r>
+        <w:t>Conversion program\DBUpgrade724To81Main.fmx</w:t>
+      </w:r>
+    </w:p>
+    <w:p>
+      <w:pPr>
+        <w:pStyle w:val="Heading2"/>
+      </w:pPr>
+      <w:r>
+        <w:t>Conversion behavior</w:t>
+      </w:r>
+    </w:p>
+    <w:tbl>
+      <w:tblPr>
+        <w:tblW w:type="auto" w:w="0"/>
+        <w:jc w:val="center"/>
+        <w:tblLayout w:type="fixed"/>
+        <w:tblLook w:firstColumn="1" w:firstRow="1" w:lastColumn="0" w:lastRow="0" w:noHBand="0" w:noVBand="1" w:val="04A0"/>
+        <w:tblBorders>
+          <w:top w:val="single" w:sz="4" w:space="0" w:color="B8C7D9"/>
+          <w:left w:val="single" w:sz="4" w:space="0" w:color="B8C7D9"/>
+          <w:bottom w:val="single" w:sz="4" w:space="0" w:color="B8C7D9"/>
+          <w:right w:val="single" w:sz="4" w:space="0" w:color="B8C7D9"/>
+          <w:insideH w:val="single" w:sz="4" w:space="0" w:color="B8C7D9"/>
+          <w:insideV w:val="single" w:sz="4" w:space="0" w:color="B8C7D9"/>
+        </w:tblBorders>
+      </w:tblPr>
+      <w:tblGrid>
+        <w:gridCol w:w="5040"/>
+        <w:gridCol w:w="5040"/>
+      </w:tblGrid>
+      <w:tr>
+        <w:tc>
+          <w:tcPr>
+            <w:tcW w:type="dxa" w:w="3024"/>
+            <w:vAlign w:val="top"/>
+            <w:shd w:fill="E8EEF5"/>
+          </w:tcPr>
+          <w:p>
+            <w:pPr>
+              <w:spacing w:after="60"/>
+            </w:pPr>
+            <w:r>
+              <w:rPr>
+                <w:rFonts w:ascii="Calibri" w:hAnsi="Calibri"/>
+                <w:b/>
+                <w:color w:val="0B2545"/>
+                <w:sz w:val="21"/>
+              </w:rPr>
+              <w:t>Component</w:t>
+            </w:r>
+          </w:p>
+        </w:tc>
+        <w:tc>
+          <w:tcPr>
+            <w:tcW w:type="dxa" w:w="6336"/>
+            <w:vAlign w:val="top"/>
+            <w:shd w:fill="E8EEF5"/>
+          </w:tcPr>
+          <w:p>
+            <w:pPr>
+              <w:spacing w:after="60"/>
+            </w:pPr>
+            <w:r>
+              <w:rPr>
+                <w:rFonts w:ascii="Calibri" w:hAnsi="Calibri"/>
+                <w:b/>
+                <w:color w:val="0B2545"/>
+                <w:sz w:val="21"/>
+              </w:rPr>
+              <w:t>Behavior</w:t>
+            </w:r>
+          </w:p>
+        </w:tc>
+      </w:tr>
+      <w:tr>
+        <w:tc>
+          <w:tcPr>
+            <w:tcW w:type="dxa" w:w="3024"/>
+            <w:vAlign w:val="top"/>
+          </w:tcPr>
+          <w:p>
+            <w:pPr>
+              <w:spacing w:after="60"/>
+            </w:pPr>
+            <w:r>
+              <w:rPr>
+                <w:rFonts w:ascii="Calibri" w:hAnsi="Calibri"/>
+                <w:sz w:val="21"/>
+              </w:rPr>
+              <w:t>Backup</w:t>
+            </w:r>
+          </w:p>
+        </w:tc>
+        <w:tc>
+          <w:tcPr>
+            <w:tcW w:type="dxa" w:w="6336"/>
+            <w:vAlign w:val="top"/>
+          </w:tcPr>
+          <w:p>
+            <w:pPr>
+              <w:spacing w:after="60"/>
+            </w:pPr>
+            <w:r>
+              <w:rPr>
+                <w:rFonts w:ascii="Calibri" w:hAnsi="Calibri"/>
+                <w:sz w:val="21"/>
+              </w:rPr>
+              <w:t>Copies the selected database to databases\backup before modifying it.</w:t>
+            </w:r>
+          </w:p>
+        </w:tc>
+      </w:tr>
+      <w:tr>
+        <w:tc>
+          <w:tcPr>
+            <w:tcW w:type="dxa" w:w="3024"/>
+            <w:vAlign w:val="top"/>
+          </w:tcPr>
+          <w:p>
+            <w:pPr>
+              <w:spacing w:after="60"/>
+            </w:pPr>
+            <w:r>
+              <w:rPr>
+                <w:rFonts w:ascii="Calibri" w:hAnsi="Calibri"/>
+                <w:sz w:val="21"/>
+              </w:rPr>
+              <w:t>Random directory schema</w:t>
+            </w:r>
+          </w:p>
+        </w:tc>
+        <w:tc>
+          <w:tcPr>
+            <w:tcW w:type="dxa" w:w="6336"/>
+            <w:vAlign w:val="top"/>
+          </w:tcPr>
+          <w:p>
+            <w:pPr>
+              <w:spacing w:after="60"/>
+            </w:pPr>
+            <w:r>
+              <w:rPr>
+                <w:rFonts w:ascii="Calibri" w:hAnsi="Calibri"/>
+                <w:sz w:val="21"/>
+              </w:rPr>
+              <w:t>Renames the old wide PL_RAND_DIR_ROTATION table and creates the version 8.1 row-based slot table.</w:t>
+            </w:r>
+          </w:p>
+        </w:tc>
+      </w:tr>
+      <w:tr>
+        <w:tc>
+          <w:tcPr>
+            <w:tcW w:type="dxa" w:w="3024"/>
+            <w:vAlign w:val="top"/>
+          </w:tcPr>
+          <w:p>
+            <w:pPr>
+              <w:spacing w:after="60"/>
+            </w:pPr>
+            <w:r>
+              <w:rPr>
+                <w:rFonts w:ascii="Calibri" w:hAnsi="Calibri"/>
+                <w:sz w:val="21"/>
+              </w:rPr>
+              <w:t>Silence schedule</w:t>
+            </w:r>
+          </w:p>
+        </w:tc>
+        <w:tc>
+          <w:tcPr>
+            <w:tcW w:type="dxa" w:w="6336"/>
+            <w:vAlign w:val="top"/>
+          </w:tcPr>
+          <w:p>
+            <w:pPr>
+              <w:spacing w:after="60"/>
+            </w:pPr>
+            <w:r>
+              <w:rPr>
+                <w:rFonts w:ascii="Calibri" w:hAnsi="Calibri"/>
+                <w:sz w:val="21"/>
+              </w:rPr>
+              <w:t>Creates silence_schedule and verifies 12 disabled rows.</w:t>
+            </w:r>
+          </w:p>
+        </w:tc>
+      </w:tr>
+      <w:tr>
+        <w:tc>
+          <w:tcPr>
+            <w:tcW w:type="dxa" w:w="3024"/>
+            <w:vAlign w:val="top"/>
+          </w:tcPr>
+          <w:p>
+            <w:pPr>
+              <w:spacing w:after="60"/>
+            </w:pPr>
+            <w:r>
+              <w:rPr>
+                <w:rFonts w:ascii="Calibri" w:hAnsi="Calibri"/>
+                <w:sz w:val="21"/>
+              </w:rPr>
+              <w:t>Settings schema</w:t>
+            </w:r>
+          </w:p>
+        </w:tc>
+        <w:tc>
+          <w:tcPr>
+            <w:tcW w:type="dxa" w:w="6336"/>
+            <w:vAlign w:val="top"/>
+          </w:tcPr>
+          <w:p>
+            <w:pPr>
+              <w:spacing w:after="60"/>
+            </w:pPr>
+            <w:r>
+              <w:rPr>
+                <w:rFonts w:ascii="Calibri" w:hAnsi="Calibri"/>
+                <w:sz w:val="21"/>
+              </w:rPr>
+              <w:t>Adds missing PL_SETTINGS columns used by version 8.1.</w:t>
+            </w:r>
+          </w:p>
+        </w:tc>
+      </w:tr>
+      <w:tr>
+        <w:tc>
+          <w:tcPr>
+            <w:tcW w:type="dxa" w:w="3024"/>
+            <w:vAlign w:val="top"/>
+          </w:tcPr>
+          <w:p>
+            <w:pPr>
+              <w:spacing w:after="60"/>
+            </w:pPr>
+            <w:r>
+              <w:rPr>
+                <w:rFonts w:ascii="Calibri" w:hAnsi="Calibri"/>
+                <w:sz w:val="21"/>
+              </w:rPr>
+              <w:t>Group synchronization</w:t>
+            </w:r>
+          </w:p>
+        </w:tc>
+        <w:tc>
+          <w:tcPr>
+            <w:tcW w:type="dxa" w:w="6336"/>
+            <w:vAlign w:val="top"/>
+          </w:tcPr>
+          <w:p>
+            <w:pPr>
+              <w:spacing w:after="60"/>
+            </w:pPr>
+            <w:r>
+              <w:rPr>
+                <w:rFonts w:ascii="Calibri" w:hAnsi="Calibri"/>
+                <w:sz w:val="21"/>
+              </w:rPr>
+              <w:t>Copies seasonal group dates and PLAY_TIME into matching playlist rows.</w:t>
+            </w:r>
+          </w:p>
+        </w:tc>
+      </w:tr>
+      <w:tr>
+        <w:tc>
+          <w:tcPr>
+            <w:tcW w:type="dxa" w:w="3024"/>
+            <w:vAlign w:val="top"/>
+          </w:tcPr>
+          <w:p>
+            <w:pPr>
+              <w:spacing w:after="60"/>
+            </w:pPr>
+            <w:r>
+              <w:rPr>
+                <w:rFonts w:ascii="Calibri" w:hAnsi="Calibri"/>
+                <w:sz w:val="21"/>
+              </w:rPr>
+              <w:t>Time normalization</w:t>
+            </w:r>
+          </w:p>
+        </w:tc>
+        <w:tc>
+          <w:tcPr>
+            <w:tcW w:type="dxa" w:w="6336"/>
+            <w:vAlign w:val="top"/>
+          </w:tcPr>
+          <w:p>
+            <w:pPr>
+              <w:spacing w:after="60"/>
+            </w:pPr>
+            <w:r>
+              <w:rPr>
+                <w:rFonts w:ascii="Calibri" w:hAnsi="Calibri"/>
+                <w:sz w:val="21"/>
+              </w:rPr>
+              <w:t>Normalizes supported time columns so seconds are retained.</w:t>
+            </w:r>
+          </w:p>
+        </w:tc>
+      </w:tr>
+      <w:tr>
+        <w:tc>
+          <w:tcPr>
+            <w:tcW w:type="dxa" w:w="3024"/>
+            <w:vAlign w:val="top"/>
+          </w:tcPr>
+          <w:p>
+            <w:pPr>
+              <w:spacing w:after="60"/>
+            </w:pPr>
+            <w:r>
+              <w:rPr>
+                <w:rFonts w:ascii="Calibri" w:hAnsi="Calibri"/>
+                <w:sz w:val="21"/>
+              </w:rPr>
+              <w:t>Reporting</w:t>
+            </w:r>
+          </w:p>
+        </w:tc>
+        <w:tc>
+          <w:tcPr>
+            <w:tcW w:type="dxa" w:w="6336"/>
+            <w:vAlign w:val="top"/>
+          </w:tcPr>
+          <w:p>
+            <w:pPr>
+              <w:spacing w:after="60"/>
+            </w:pPr>
+            <w:r>
+              <w:rPr>
+                <w:rFonts w:ascii="Calibri" w:hAnsi="Calibri"/>
+                <w:sz w:val="21"/>
+              </w:rPr>
+              <w:t>Writes DatabaseUpgrade_724_to_81_*.txt under the portable logs folder.</w:t>
+            </w:r>
+          </w:p>
+        </w:tc>
+      </w:tr>
+    </w:tbl>
+    <w:p>
+      <w:pPr>
+        <w:pStyle w:val="Heading2"/>
+      </w:pPr>
+      <w:r>
+        <w:t>Operational constraints</w:t>
+      </w:r>
+    </w:p>
+    <w:p>
+      <w:pPr>
+        <w:pStyle w:val="ListBullet"/>
+        <w:spacing w:after="80"/>
+        <w:ind w:left="540" w:hanging="271"/>
+      </w:pPr>
+      <w:r>
+        <w:t>The main Carillon application should not be running during conversion.</w:t>
+      </w:r>
+    </w:p>
+    <w:p>
+      <w:pPr>
+        <w:pStyle w:val="ListBullet"/>
+        <w:spacing w:after="80"/>
+        <w:ind w:left="540" w:hanging="271"/>
+      </w:pPr>
+      <w:r>
+        <w:t>The selected database must contain playlist and seasonalgroups tables.</w:t>
+      </w:r>
+    </w:p>
+    <w:p>
+      <w:pPr>
+        <w:pStyle w:val="ListBullet"/>
+        <w:spacing w:after="80"/>
+        <w:ind w:left="540" w:hanging="271"/>
+      </w:pPr>
+      <w:r>
+        <w:t>The converter detects 8.1-compatible, 7.2.4 wide random-directory format, and unknown/partial database states.</w:t>
+      </w:r>
+    </w:p>
+    <w:p>
+      <w:pPr>
+        <w:pStyle w:val="ListBullet"/>
+        <w:spacing w:after="80"/>
+        <w:ind w:left="540" w:hanging="271"/>
+      </w:pPr>
+      <w:r>
+        <w:t>For best report placement, run the utility from the portable drive root and select databases\carillon.db.</w:t>
       </w:r>
     </w:p>
     <w:sectPr>

</xml_diff>